<commit_message>
Documentacion de y revision de funciones
</commit_message>
<xml_diff>
--- a/TFM_MarioSoto/src/codigo/procesamiento_datos/docs/Adicion_pipleine_bdd.docx
+++ b/TFM_MarioSoto/src/codigo/procesamiento_datos/docs/Adicion_pipleine_bdd.docx
@@ -14,7 +14,7 @@
           <w:b/>
           <w:bCs/>
         </w:rPr>
-        <w:t>Añadido al pipeline general: Base de datos relacional viva</w:t>
+        <w:t>Base de datos relacional</w:t>
       </w:r>
     </w:p>
     <w:p>
@@ -29,21 +29,13 @@
         <w:t>base de datos relacional gestionada</w:t>
       </w:r>
       <w:r>
-        <w:t xml:space="preserve">, que permite almacenar todos los datos procesados de forma estructurada, mantener relaciones entre entidades y soportar actualizaciones frecuentes. Esta capa complementa el Data Lake y la capa de análisis, sin interferir con los flujos de machine </w:t>
-      </w:r>
-      <w:proofErr w:type="spellStart"/>
-      <w:r>
-        <w:t>learning</w:t>
-      </w:r>
-      <w:proofErr w:type="spellEnd"/>
-      <w:r>
-        <w:t>.</w:t>
+        <w:t>, que permite almacenar todos los datos procesados de forma estructurada, mantener relaciones entre entidades y soportar actualizaciones frecuentes. Esta capa complementa el Data Lake y la capa de análisis, sin interferir con los flujos de machine learning.</w:t>
       </w:r>
     </w:p>
     <w:p>
       <w:r>
         <w:pict w14:anchorId="41996325">
-          <v:rect id="_x0000_i1055" style="width:0;height:1.5pt" o:hralign="center" o:hrstd="t" o:hr="t" fillcolor="#a0a0a0" stroked="f"/>
+          <v:rect id="_x0000_i1025" style="width:0;height:1.5pt" o:hralign="center" o:hrstd="t" o:hr="t" fillcolor="#a0a0a0" stroked="f"/>
         </w:pict>
       </w:r>
     </w:p>
@@ -74,23 +66,7 @@
         <w:t>después de los datos procesados en S3</w:t>
       </w:r>
       <w:r>
-        <w:t xml:space="preserve"> y de la validación realizada por los </w:t>
-      </w:r>
-      <w:proofErr w:type="spellStart"/>
-      <w:r>
-        <w:t>jobs</w:t>
-      </w:r>
-      <w:proofErr w:type="spellEnd"/>
-      <w:r>
-        <w:t xml:space="preserve"> de </w:t>
-      </w:r>
-      <w:proofErr w:type="spellStart"/>
-      <w:r>
-        <w:t>Glue</w:t>
-      </w:r>
-      <w:proofErr w:type="spellEnd"/>
-      <w:r>
-        <w:t>, de forma que:</w:t>
+        <w:t xml:space="preserve"> y de la validación realizada por los jobs de Glue, de forma que:</w:t>
       </w:r>
     </w:p>
     <w:p>
@@ -112,21 +88,8 @@
         </w:numPr>
       </w:pPr>
       <w:r>
-        <w:t xml:space="preserve">Se pueden insertar o actualizar en Aurora PostgreSQL mediante procesos </w:t>
-      </w:r>
-      <w:proofErr w:type="spellStart"/>
-      <w:r>
-        <w:t>batch</w:t>
-      </w:r>
-      <w:proofErr w:type="spellEnd"/>
-      <w:r>
-        <w:t xml:space="preserve"> o </w:t>
-      </w:r>
-      <w:proofErr w:type="spellStart"/>
-      <w:r>
-        <w:t>micro-batch</w:t>
-      </w:r>
-      <w:proofErr w:type="spellEnd"/>
+        <w:t>Se pueden insertar o actualizar en Aurora PostgreSQL mediante procesos batch o micro-batch</w:t>
+      </w:r>
     </w:p>
     <w:p>
       <w:pPr>
@@ -208,13 +171,8 @@
     </w:p>
     <w:p>
       <w:r>
-        <w:t xml:space="preserve">BI / </w:t>
-      </w:r>
-      <w:proofErr w:type="spellStart"/>
-      <w:r>
-        <w:t>Dashboards</w:t>
-      </w:r>
-      <w:proofErr w:type="spellEnd"/>
+        <w:t>BI / Dashboards</w:t>
+      </w:r>
     </w:p>
     <w:p>
       <w:r>
@@ -223,18 +181,13 @@
     </w:p>
     <w:p>
       <w:r>
-        <w:t xml:space="preserve">Analistas / </w:t>
-      </w:r>
-      <w:proofErr w:type="spellStart"/>
-      <w:r>
-        <w:t>Stakeholders</w:t>
-      </w:r>
-      <w:proofErr w:type="spellEnd"/>
+        <w:t>Analistas / Stakeholders</w:t>
+      </w:r>
     </w:p>
     <w:p>
       <w:r>
         <w:pict w14:anchorId="347D54A4">
-          <v:rect id="_x0000_i1056" style="width:0;height:1.5pt" o:hralign="center" o:hrstd="t" o:hr="t" fillcolor="#a0a0a0" stroked="f"/>
+          <v:rect id="_x0000_i1026" style="width:0;height:1.5pt" o:hralign="center" o:hrstd="t" o:hr="t" fillcolor="#a0a0a0" stroked="f"/>
         </w:pict>
       </w:r>
     </w:p>
@@ -420,11 +373,9 @@
             <w:hideMark/>
           </w:tcPr>
           <w:p>
-            <w:proofErr w:type="spellStart"/>
             <w:r>
               <w:t>athletes</w:t>
             </w:r>
-            <w:proofErr w:type="spellEnd"/>
           </w:p>
         </w:tc>
         <w:tc>
@@ -434,11 +385,9 @@
             <w:hideMark/>
           </w:tcPr>
           <w:p>
-            <w:proofErr w:type="spellStart"/>
             <w:r>
               <w:t>athlete_id</w:t>
             </w:r>
-            <w:proofErr w:type="spellEnd"/>
           </w:p>
         </w:tc>
         <w:tc>
@@ -465,12 +414,10 @@
             <w:hideMark/>
           </w:tcPr>
           <w:p>
-            <w:proofErr w:type="spellStart"/>
             <w:r>
               <w:lastRenderedPageBreak/>
               <w:t>events</w:t>
             </w:r>
-            <w:proofErr w:type="spellEnd"/>
           </w:p>
         </w:tc>
         <w:tc>
@@ -480,11 +427,9 @@
             <w:hideMark/>
           </w:tcPr>
           <w:p>
-            <w:proofErr w:type="spellStart"/>
             <w:r>
               <w:t>event_id</w:t>
             </w:r>
-            <w:proofErr w:type="spellEnd"/>
           </w:p>
         </w:tc>
         <w:tc>
@@ -544,15 +489,7 @@
           </w:tcPr>
           <w:p>
             <w:r>
-              <w:t xml:space="preserve">INSERT, reemplazo solo si se </w:t>
-            </w:r>
-            <w:proofErr w:type="spellStart"/>
-            <w:r>
-              <w:t>re-procesa</w:t>
-            </w:r>
-            <w:proofErr w:type="spellEnd"/>
-            <w:r>
-              <w:t xml:space="preserve"> la carrera</w:t>
+              <w:t>INSERT, reemplazo solo si se re-procesa la carrera</w:t>
             </w:r>
           </w:p>
         </w:tc>
@@ -568,11 +505,9 @@
             <w:hideMark/>
           </w:tcPr>
           <w:p>
-            <w:proofErr w:type="spellStart"/>
             <w:r>
               <w:t>races</w:t>
             </w:r>
-            <w:proofErr w:type="spellEnd"/>
           </w:p>
         </w:tc>
         <w:tc>
@@ -582,11 +517,9 @@
             <w:hideMark/>
           </w:tcPr>
           <w:p>
-            <w:proofErr w:type="spellStart"/>
             <w:r>
               <w:t>race_id</w:t>
             </w:r>
-            <w:proofErr w:type="spellEnd"/>
           </w:p>
         </w:tc>
         <w:tc>
@@ -613,21 +546,12 @@
       <w:r>
         <w:t xml:space="preserve"> En Aurora PostgreSQL esto se implementa mediante </w:t>
       </w:r>
-      <w:proofErr w:type="spellStart"/>
-      <w:r>
-        <w:rPr>
-          <w:b/>
-          <w:bCs/>
-        </w:rPr>
-        <w:t>upserts</w:t>
-      </w:r>
-      <w:proofErr w:type="spellEnd"/>
-      <w:r>
-        <w:rPr>
-          <w:b/>
-          <w:bCs/>
-        </w:rPr>
-        <w:t xml:space="preserve"> (INSERT ... ON CONFLICT)</w:t>
+      <w:r>
+        <w:rPr>
+          <w:b/>
+          <w:bCs/>
+        </w:rPr>
+        <w:t>upserts (INSERT ... ON CONFLICT)</w:t>
       </w:r>
       <w:r>
         <w:t>, garantizando consistencia mientras se añaden nuevas carreras.</w:t>
@@ -636,7 +560,7 @@
     <w:p>
       <w:r>
         <w:pict w14:anchorId="4724D505">
-          <v:rect id="_x0000_i1057" style="width:0;height:1.5pt" o:hralign="center" o:hrstd="t" o:hr="t" fillcolor="#a0a0a0" stroked="f"/>
+          <v:rect id="_x0000_i1027" style="width:0;height:1.5pt" o:hralign="center" o:hrstd="t" o:hr="t" fillcolor="#a0a0a0" stroked="f"/>
         </w:pict>
       </w:r>
     </w:p>
@@ -675,21 +599,12 @@
       <w:r>
         <w:t xml:space="preserve"> mediante </w:t>
       </w:r>
-      <w:proofErr w:type="spellStart"/>
-      <w:r>
-        <w:rPr>
-          <w:b/>
-          <w:bCs/>
-        </w:rPr>
-        <w:t>Glue</w:t>
-      </w:r>
-      <w:proofErr w:type="spellEnd"/>
-      <w:r>
-        <w:rPr>
-          <w:b/>
-          <w:bCs/>
-        </w:rPr>
-        <w:t xml:space="preserve"> Jobs o scripts Python</w:t>
+      <w:r>
+        <w:rPr>
+          <w:b/>
+          <w:bCs/>
+        </w:rPr>
+        <w:t>Glue Jobs o scripts Python</w:t>
       </w:r>
     </w:p>
     <w:p>
@@ -700,15 +615,7 @@
         </w:numPr>
       </w:pPr>
       <w:r>
-        <w:t xml:space="preserve">Los resultados analíticos generados previamente (Python </w:t>
-      </w:r>
-      <w:proofErr w:type="spellStart"/>
-      <w:r>
-        <w:t>Analytics</w:t>
-      </w:r>
-      <w:proofErr w:type="spellEnd"/>
-      <w:r>
-        <w:t xml:space="preserve"> Job → S3 ANALYTICS) se pueden consultar </w:t>
+        <w:t xml:space="preserve">Los resultados analíticos generados previamente (Python Analytics Job → S3 ANALYTICS) se pueden consultar </w:t>
       </w:r>
       <w:r>
         <w:rPr>
@@ -745,7 +652,7 @@
     <w:p>
       <w:r>
         <w:pict w14:anchorId="6B0CF88E">
-          <v:rect id="_x0000_i1058" style="width:0;height:1.5pt" o:hralign="center" o:hrstd="t" o:hr="t" fillcolor="#a0a0a0" stroked="f"/>
+          <v:rect id="_x0000_i1028" style="width:0;height:1.5pt" o:hralign="center" o:hrstd="t" o:hr="t" fillcolor="#a0a0a0" stroked="f"/>
         </w:pict>
       </w:r>
     </w:p>
@@ -774,7 +681,6 @@
       <w:r>
         <w:t xml:space="preserve">Herramientas de BI como </w:t>
       </w:r>
-      <w:proofErr w:type="spellStart"/>
       <w:r>
         <w:rPr>
           <w:b/>
@@ -782,11 +688,9 @@
         </w:rPr>
         <w:t>QuickSight</w:t>
       </w:r>
-      <w:proofErr w:type="spellEnd"/>
       <w:r>
         <w:t xml:space="preserve">, </w:t>
       </w:r>
-      <w:proofErr w:type="spellStart"/>
       <w:r>
         <w:rPr>
           <w:b/>
@@ -794,25 +698,15 @@
         </w:rPr>
         <w:t>Tableau</w:t>
       </w:r>
-      <w:proofErr w:type="spellEnd"/>
       <w:r>
         <w:t xml:space="preserve"> o </w:t>
       </w:r>
-      <w:proofErr w:type="spellStart"/>
-      <w:r>
-        <w:rPr>
-          <w:b/>
-          <w:bCs/>
-        </w:rPr>
-        <w:t>Power</w:t>
-      </w:r>
-      <w:proofErr w:type="spellEnd"/>
-      <w:r>
-        <w:rPr>
-          <w:b/>
-          <w:bCs/>
-        </w:rPr>
-        <w:t xml:space="preserve"> BI</w:t>
+      <w:r>
+        <w:rPr>
+          <w:b/>
+          <w:bCs/>
+        </w:rPr>
+        <w:t>Power BI</w:t>
       </w:r>
       <w:r>
         <w:t xml:space="preserve"> se conectan a Aurora para:</w:t>
@@ -825,13 +719,8 @@
           <w:numId w:val="4"/>
         </w:numPr>
       </w:pPr>
-      <w:proofErr w:type="spellStart"/>
-      <w:r>
-        <w:t>Dashboards</w:t>
-      </w:r>
-      <w:proofErr w:type="spellEnd"/>
-      <w:r>
-        <w:t xml:space="preserve"> de rendimiento de atletas</w:t>
+      <w:r>
+        <w:t>Dashboards de rendimiento de atletas</w:t>
       </w:r>
     </w:p>
     <w:p>
@@ -875,37 +764,13 @@
         </w:numPr>
       </w:pPr>
       <w:r>
-        <w:t xml:space="preserve">Alternativamente, los datos se pueden exportar o replicar a S3 para consultas SQL con </w:t>
-      </w:r>
-      <w:proofErr w:type="spellStart"/>
-      <w:r>
-        <w:t>Athena</w:t>
-      </w:r>
-      <w:proofErr w:type="spellEnd"/>
-      <w:r>
-        <w:t xml:space="preserve"> o </w:t>
-      </w:r>
-      <w:proofErr w:type="spellStart"/>
-      <w:r>
-        <w:t>Redshift</w:t>
-      </w:r>
-      <w:proofErr w:type="spellEnd"/>
-      <w:r>
-        <w:t xml:space="preserve"> </w:t>
-      </w:r>
-      <w:proofErr w:type="spellStart"/>
-      <w:r>
-        <w:t>Spectrum</w:t>
-      </w:r>
-      <w:proofErr w:type="spellEnd"/>
-      <w:r>
-        <w:t>, combinando análisis histórico y análisis en tiempo real.</w:t>
+        <w:t>Alternativamente, los datos se pueden exportar o replicar a S3 para consultas SQL con Athena o Redshift Spectrum, combinando análisis histórico y análisis en tiempo real.</w:t>
       </w:r>
     </w:p>
     <w:p>
       <w:r>
         <w:pict w14:anchorId="6BA85452">
-          <v:rect id="_x0000_i1059" style="width:0;height:1.5pt" o:hralign="center" o:hrstd="t" o:hr="t" fillcolor="#a0a0a0" stroked="f"/>
+          <v:rect id="_x0000_i1029" style="width:0;height:1.5pt" o:hralign="center" o:hrstd="t" o:hr="t" fillcolor="#a0a0a0" stroked="f"/>
         </w:pict>
       </w:r>
     </w:p>

</xml_diff>